<commit_message>
Changes based on v4 of Spec
These new payload examples have been confirmed to be spec compliant at v4 level
</commit_message>
<xml_diff>
--- a/OpenCDC-PayloadExamples.docx
+++ b/OpenCDC-PayloadExamples.docx
@@ -1748,7 +1748,7 @@
                 <w:sz w:val="17"/>
                 <w:szCs w:val="17"/>
               </w:rPr>
-              <w:t>""</w:t>
+              <w:t>"</w:t>
             </w:r>
             <w:r>
               <w:rPr>
@@ -1971,7 +1971,7 @@
                 <w:sz w:val="17"/>
                 <w:szCs w:val="17"/>
               </w:rPr>
-              <w:t>"0.3"</w:t>
+              <w:t>"0.2"</w:t>
             </w:r>
             <w:r>
               <w:rPr>
@@ -2089,7 +2089,56 @@
                 <w:sz w:val="17"/>
                 <w:szCs w:val="17"/>
               </w:rPr>
-              <w:t>"Oracle GoldenGate 26.</w:t>
+              <w:t>"Oracle GoldenGate 26.1"</w:t>
+            </w:r>
+            <w:r>
+              <w:rPr>
+                <w:rFonts w:ascii="Courier New" w:eastAsia="Courier New" w:hAnsi="Courier New" w:cs="Courier New"/>
+                <w:color w:val="8B949E"/>
+                <w:sz w:val="17"/>
+                <w:szCs w:val="17"/>
+              </w:rPr>
+              <w:t>,</w:t>
+            </w:r>
+          </w:p>
+          <w:p>
+            <w:r>
+              <w:rPr>
+                <w:rFonts w:ascii="Courier New" w:eastAsia="Courier New" w:hAnsi="Courier New" w:cs="Courier New"/>
+                <w:color w:val="D4D4D4"/>
+                <w:sz w:val="17"/>
+                <w:szCs w:val="17"/>
+              </w:rPr>
+              <w:t xml:space="preserve">    </w:t>
+            </w:r>
+            <w:r>
+              <w:rPr>
+                <w:rFonts w:ascii="Courier New" w:eastAsia="Courier New" w:hAnsi="Courier New" w:cs="Courier New"/>
+                <w:b/>
+                <w:bCs/>
+                <w:color w:val="79C0FF"/>
+                <w:sz w:val="17"/>
+                <w:szCs w:val="17"/>
+              </w:rPr>
+              <w:t>"opencdc_version"</w:t>
+            </w:r>
+            <w:r>
+              <w:rPr>
+                <w:rFonts w:ascii="Courier New" w:eastAsia="Courier New" w:hAnsi="Courier New" w:cs="Courier New"/>
+                <w:color w:val="8B949E"/>
+                <w:sz w:val="17"/>
+                <w:szCs w:val="17"/>
+              </w:rPr>
+              <w:t>:</w:t>
+            </w:r>
+            <w:r>
+              <w:rPr>
+                <w:rFonts w:ascii="Courier New" w:eastAsia="Courier New" w:hAnsi="Courier New" w:cs="Courier New"/>
+                <w:color w:val="D4D4D4"/>
+                <w:sz w:val="17"/>
+                <w:szCs w:val="17"/>
+              </w:rPr>
+              <w:t xml:space="preserve">            </w:t>
             </w:r>
             <w:r>
               <w:rPr>
@@ -2098,7 +2147,56 @@
                 <w:sz w:val="17"/>
                 <w:szCs w:val="17"/>
               </w:rPr>
-              <w:t>1</w:t>
+              <w:t>"0.2"</w:t>
+            </w:r>
+            <w:r>
+              <w:rPr>
+                <w:rFonts w:ascii="Courier New" w:eastAsia="Courier New" w:hAnsi="Courier New" w:cs="Courier New"/>
+                <w:color w:val="8B949E"/>
+                <w:sz w:val="17"/>
+                <w:szCs w:val="17"/>
+              </w:rPr>
+              <w:t>,</w:t>
+            </w:r>
+          </w:p>
+          <w:p>
+            <w:r>
+              <w:rPr>
+                <w:rFonts w:ascii="Courier New" w:eastAsia="Courier New" w:hAnsi="Courier New" w:cs="Courier New"/>
+                <w:color w:val="D4D4D4"/>
+                <w:sz w:val="17"/>
+                <w:szCs w:val="17"/>
+              </w:rPr>
+              <w:t xml:space="preserve">    </w:t>
+            </w:r>
+            <w:r>
+              <w:rPr>
+                <w:rFonts w:ascii="Courier New" w:eastAsia="Courier New" w:hAnsi="Courier New" w:cs="Courier New"/>
+                <w:b/>
+                <w:bCs/>
+                <w:color w:val="79C0FF"/>
+                <w:sz w:val="17"/>
+                <w:szCs w:val="17"/>
+              </w:rPr>
+              <w:t>"source_db"</w:t>
+            </w:r>
+            <w:r>
+              <w:rPr>
+                <w:rFonts w:ascii="Courier New" w:eastAsia="Courier New" w:hAnsi="Courier New" w:cs="Courier New"/>
+                <w:color w:val="8B949E"/>
+                <w:sz w:val="17"/>
+                <w:szCs w:val="17"/>
+              </w:rPr>
+              <w:t>:</w:t>
+            </w:r>
+            <w:r>
+              <w:rPr>
+                <w:rFonts w:ascii="Courier New" w:eastAsia="Courier New" w:hAnsi="Courier New" w:cs="Courier New"/>
+                <w:color w:val="D4D4D4"/>
+                <w:sz w:val="17"/>
+                <w:szCs w:val="17"/>
+              </w:rPr>
+              <w:t xml:space="preserve">                  </w:t>
             </w:r>
             <w:r>
               <w:rPr>
@@ -2107,7 +2205,7 @@
                 <w:sz w:val="17"/>
                 <w:szCs w:val="17"/>
               </w:rPr>
-              <w:t>"</w:t>
+              <w:t>"Oracle 23ai"</w:t>
             </w:r>
             <w:r>
               <w:rPr>
@@ -2138,25 +2236,25 @@
                 <w:sz w:val="17"/>
                 <w:szCs w:val="17"/>
               </w:rPr>
-              <w:t>"opencdc_version"</w:t>
-            </w:r>
-            <w:r>
-              <w:rPr>
-                <w:rFonts w:ascii="Courier New" w:eastAsia="Courier New" w:hAnsi="Courier New" w:cs="Courier New"/>
-                <w:color w:val="8B949E"/>
-                <w:sz w:val="17"/>
-                <w:szCs w:val="17"/>
-              </w:rPr>
-              <w:t>:</w:t>
-            </w:r>
-            <w:r>
-              <w:rPr>
-                <w:rFonts w:ascii="Courier New" w:eastAsia="Courier New" w:hAnsi="Courier New" w:cs="Courier New"/>
-                <w:color w:val="D4D4D4"/>
-                <w:sz w:val="17"/>
-                <w:szCs w:val="17"/>
-              </w:rPr>
-              <w:t xml:space="preserve">            </w:t>
+              <w:t>"capture_mode"</w:t>
+            </w:r>
+            <w:r>
+              <w:rPr>
+                <w:rFonts w:ascii="Courier New" w:eastAsia="Courier New" w:hAnsi="Courier New" w:cs="Courier New"/>
+                <w:color w:val="8B949E"/>
+                <w:sz w:val="17"/>
+                <w:szCs w:val="17"/>
+              </w:rPr>
+              <w:t>:</w:t>
+            </w:r>
+            <w:r>
+              <w:rPr>
+                <w:rFonts w:ascii="Courier New" w:eastAsia="Courier New" w:hAnsi="Courier New" w:cs="Courier New"/>
+                <w:color w:val="D4D4D4"/>
+                <w:sz w:val="17"/>
+                <w:szCs w:val="17"/>
+              </w:rPr>
+              <w:t xml:space="preserve">               </w:t>
             </w:r>
             <w:r>
               <w:rPr>
@@ -2165,7 +2263,7 @@
                 <w:sz w:val="17"/>
                 <w:szCs w:val="17"/>
               </w:rPr>
-              <w:t>"0.3"</w:t>
+              <w:t>"GoldenGate Native"</w:t>
             </w:r>
             <w:r>
               <w:rPr>
@@ -2196,25 +2294,34 @@
                 <w:sz w:val="17"/>
                 <w:szCs w:val="17"/>
               </w:rPr>
-              <w:t>"source_db"</w:t>
-            </w:r>
-            <w:r>
-              <w:rPr>
-                <w:rFonts w:ascii="Courier New" w:eastAsia="Courier New" w:hAnsi="Courier New" w:cs="Courier New"/>
-                <w:color w:val="8B949E"/>
-                <w:sz w:val="17"/>
-                <w:szCs w:val="17"/>
-              </w:rPr>
-              <w:t>:</w:t>
-            </w:r>
-            <w:r>
-              <w:rPr>
-                <w:rFonts w:ascii="Courier New" w:eastAsia="Courier New" w:hAnsi="Courier New" w:cs="Courier New"/>
-                <w:color w:val="D4D4D4"/>
-                <w:sz w:val="17"/>
-                <w:szCs w:val="17"/>
-              </w:rPr>
-              <w:t xml:space="preserve">                  </w:t>
+              <w:t>"tables"</w:t>
+            </w:r>
+            <w:r>
+              <w:rPr>
+                <w:rFonts w:ascii="Courier New" w:eastAsia="Courier New" w:hAnsi="Courier New" w:cs="Courier New"/>
+                <w:color w:val="8B949E"/>
+                <w:sz w:val="17"/>
+                <w:szCs w:val="17"/>
+              </w:rPr>
+              <w:t>:</w:t>
+            </w:r>
+            <w:r>
+              <w:rPr>
+                <w:rFonts w:ascii="Courier New" w:eastAsia="Courier New" w:hAnsi="Courier New" w:cs="Courier New"/>
+                <w:color w:val="D4D4D4"/>
+                <w:sz w:val="17"/>
+                <w:szCs w:val="17"/>
+              </w:rPr>
+              <w:t xml:space="preserve">                     </w:t>
+            </w:r>
+            <w:r>
+              <w:rPr>
+                <w:rFonts w:ascii="Courier New" w:eastAsia="Courier New" w:hAnsi="Courier New" w:cs="Courier New"/>
+                <w:color w:val="8B949E"/>
+                <w:sz w:val="17"/>
+                <w:szCs w:val="17"/>
+              </w:rPr>
+              <w:t>[</w:t>
             </w:r>
             <w:r>
               <w:rPr>
@@ -2223,34 +2330,16 @@
                 <w:sz w:val="17"/>
                 <w:szCs w:val="17"/>
               </w:rPr>
-              <w:t>"Oracle 2</w:t>
-            </w:r>
-            <w:r>
-              <w:rPr>
-                <w:rFonts w:ascii="Courier New" w:eastAsia="Courier New" w:hAnsi="Courier New" w:cs="Courier New"/>
-                <w:color w:val="A5D6FF"/>
-                <w:sz w:val="17"/>
-                <w:szCs w:val="17"/>
-              </w:rPr>
-              <w:t>6</w:t>
-            </w:r>
-            <w:r>
-              <w:rPr>
-                <w:rFonts w:ascii="Courier New" w:eastAsia="Courier New" w:hAnsi="Courier New" w:cs="Courier New"/>
-                <w:color w:val="A5D6FF"/>
-                <w:sz w:val="17"/>
-                <w:szCs w:val="17"/>
-              </w:rPr>
-              <w:t>ai"</w:t>
-            </w:r>
-            <w:r>
-              <w:rPr>
-                <w:rFonts w:ascii="Courier New" w:eastAsia="Courier New" w:hAnsi="Courier New" w:cs="Courier New"/>
-                <w:color w:val="8B949E"/>
-                <w:sz w:val="17"/>
-                <w:szCs w:val="17"/>
-              </w:rPr>
-              <w:t>,</w:t>
+              <w:t>"FINANCE.CUSTOMER_ORDERS"</w:t>
+            </w:r>
+            <w:r>
+              <w:rPr>
+                <w:rFonts w:ascii="Courier New" w:eastAsia="Courier New" w:hAnsi="Courier New" w:cs="Courier New"/>
+                <w:color w:val="8B949E"/>
+                <w:sz w:val="17"/>
+                <w:szCs w:val="17"/>
+              </w:rPr>
+              <w:t>],</w:t>
             </w:r>
           </w:p>
           <w:p>
@@ -2272,149 +2361,6 @@
                 <w:sz w:val="17"/>
                 <w:szCs w:val="17"/>
               </w:rPr>
-              <w:t>"capture_mode"</w:t>
-            </w:r>
-            <w:r>
-              <w:rPr>
-                <w:rFonts w:ascii="Courier New" w:eastAsia="Courier New" w:hAnsi="Courier New" w:cs="Courier New"/>
-                <w:color w:val="8B949E"/>
-                <w:sz w:val="17"/>
-                <w:szCs w:val="17"/>
-              </w:rPr>
-              <w:t>:</w:t>
-            </w:r>
-            <w:r>
-              <w:rPr>
-                <w:rFonts w:ascii="Courier New" w:eastAsia="Courier New" w:hAnsi="Courier New" w:cs="Courier New"/>
-                <w:color w:val="D4D4D4"/>
-                <w:sz w:val="17"/>
-                <w:szCs w:val="17"/>
-              </w:rPr>
-              <w:t xml:space="preserve">               </w:t>
-            </w:r>
-            <w:r>
-              <w:rPr>
-                <w:rFonts w:ascii="Courier New" w:eastAsia="Courier New" w:hAnsi="Courier New" w:cs="Courier New"/>
-                <w:color w:val="A5D6FF"/>
-                <w:sz w:val="17"/>
-                <w:szCs w:val="17"/>
-              </w:rPr>
-              <w:t>"</w:t>
-            </w:r>
-            <w:r>
-              <w:rPr>
-                <w:rFonts w:ascii="Courier New" w:eastAsia="Courier New" w:hAnsi="Courier New" w:cs="Courier New"/>
-                <w:color w:val="A5D6FF"/>
-                <w:sz w:val="17"/>
-                <w:szCs w:val="17"/>
-              </w:rPr>
-              <w:t>GoldenGate Native</w:t>
-            </w:r>
-            <w:r>
-              <w:rPr>
-                <w:rFonts w:ascii="Courier New" w:eastAsia="Courier New" w:hAnsi="Courier New" w:cs="Courier New"/>
-                <w:color w:val="A5D6FF"/>
-                <w:sz w:val="17"/>
-                <w:szCs w:val="17"/>
-              </w:rPr>
-              <w:t>"</w:t>
-            </w:r>
-            <w:r>
-              <w:rPr>
-                <w:rFonts w:ascii="Courier New" w:eastAsia="Courier New" w:hAnsi="Courier New" w:cs="Courier New"/>
-                <w:color w:val="8B949E"/>
-                <w:sz w:val="17"/>
-                <w:szCs w:val="17"/>
-              </w:rPr>
-              <w:t>,</w:t>
-            </w:r>
-          </w:p>
-          <w:p>
-            <w:r>
-              <w:rPr>
-                <w:rFonts w:ascii="Courier New" w:eastAsia="Courier New" w:hAnsi="Courier New" w:cs="Courier New"/>
-                <w:color w:val="D4D4D4"/>
-                <w:sz w:val="17"/>
-                <w:szCs w:val="17"/>
-              </w:rPr>
-              <w:t xml:space="preserve">    </w:t>
-            </w:r>
-            <w:r>
-              <w:rPr>
-                <w:rFonts w:ascii="Courier New" w:eastAsia="Courier New" w:hAnsi="Courier New" w:cs="Courier New"/>
-                <w:b/>
-                <w:bCs/>
-                <w:color w:val="79C0FF"/>
-                <w:sz w:val="17"/>
-                <w:szCs w:val="17"/>
-              </w:rPr>
-              <w:t>"tables"</w:t>
-            </w:r>
-            <w:r>
-              <w:rPr>
-                <w:rFonts w:ascii="Courier New" w:eastAsia="Courier New" w:hAnsi="Courier New" w:cs="Courier New"/>
-                <w:color w:val="8B949E"/>
-                <w:sz w:val="17"/>
-                <w:szCs w:val="17"/>
-              </w:rPr>
-              <w:t>:</w:t>
-            </w:r>
-            <w:r>
-              <w:rPr>
-                <w:rFonts w:ascii="Courier New" w:eastAsia="Courier New" w:hAnsi="Courier New" w:cs="Courier New"/>
-                <w:color w:val="D4D4D4"/>
-                <w:sz w:val="17"/>
-                <w:szCs w:val="17"/>
-              </w:rPr>
-              <w:t xml:space="preserve">                     </w:t>
-            </w:r>
-            <w:r>
-              <w:rPr>
-                <w:rFonts w:ascii="Courier New" w:eastAsia="Courier New" w:hAnsi="Courier New" w:cs="Courier New"/>
-                <w:color w:val="8B949E"/>
-                <w:sz w:val="17"/>
-                <w:szCs w:val="17"/>
-              </w:rPr>
-              <w:t>[</w:t>
-            </w:r>
-            <w:r>
-              <w:rPr>
-                <w:rFonts w:ascii="Courier New" w:eastAsia="Courier New" w:hAnsi="Courier New" w:cs="Courier New"/>
-                <w:color w:val="A5D6FF"/>
-                <w:sz w:val="17"/>
-                <w:szCs w:val="17"/>
-              </w:rPr>
-              <w:t>"FINANCE.CUSTOMER_ORDERS"</w:t>
-            </w:r>
-            <w:r>
-              <w:rPr>
-                <w:rFonts w:ascii="Courier New" w:eastAsia="Courier New" w:hAnsi="Courier New" w:cs="Courier New"/>
-                <w:color w:val="8B949E"/>
-                <w:sz w:val="17"/>
-                <w:szCs w:val="17"/>
-              </w:rPr>
-              <w:t>],</w:t>
-            </w:r>
-          </w:p>
-          <w:p>
-            <w:r>
-              <w:rPr>
-                <w:rFonts w:ascii="Courier New" w:eastAsia="Courier New" w:hAnsi="Courier New" w:cs="Courier New"/>
-                <w:color w:val="D4D4D4"/>
-                <w:sz w:val="17"/>
-                <w:szCs w:val="17"/>
-              </w:rPr>
-              <w:t xml:space="preserve">    </w:t>
-            </w:r>
-            <w:r>
-              <w:rPr>
-                <w:rFonts w:ascii="Courier New" w:eastAsia="Courier New" w:hAnsi="Courier New" w:cs="Courier New"/>
-                <w:b/>
-                <w:bCs/>
-                <w:color w:val="79C0FF"/>
-                <w:sz w:val="17"/>
-                <w:szCs w:val="17"/>
-              </w:rPr>
               <w:t>"heartbeat_interval_seconds"</w:t>
             </w:r>
             <w:r>
@@ -2442,7 +2388,84 @@
                 <w:sz w:val="17"/>
                 <w:szCs w:val="17"/>
               </w:rPr>
-              <w:t>30</w:t>
+              <w:t>30,</w:t>
+            </w:r>
+          </w:p>
+          <w:p>
+            <w:r>
+              <w:rPr>
+                <w:rFonts w:ascii="Courier New" w:eastAsia="Courier New" w:hAnsi="Courier New" w:cs="Courier New"/>
+                <w:color w:val="9CDCFE"/>
+                <w:sz w:val="17"/>
+                <w:szCs w:val="17"/>
+              </w:rPr>
+              <w:t xml:space="preserve">    "schema_delivery": {</w:t>
+            </w:r>
+          </w:p>
+          <w:p>
+            <w:r>
+              <w:rPr>
+                <w:rFonts w:ascii="Courier New" w:eastAsia="Courier New" w:hAnsi="Courier New" w:cs="Courier New"/>
+                <w:color w:val="9CDCFE"/>
+                <w:sz w:val="17"/>
+                <w:szCs w:val="17"/>
+              </w:rPr>
+              <w:t xml:space="preserve">      "schema_on_change":       true,</w:t>
+            </w:r>
+          </w:p>
+          <w:p>
+            <w:r>
+              <w:rPr>
+                <w:rFonts w:ascii="Courier New" w:eastAsia="Courier New" w:hAnsi="Courier New" w:cs="Courier New"/>
+                <w:color w:val="9CDCFE"/>
+                <w:sz w:val="17"/>
+                <w:szCs w:val="17"/>
+              </w:rPr>
+              <w:t xml:space="preserve">      "schema_on_reconnect":    true,</w:t>
+            </w:r>
+          </w:p>
+          <w:p>
+            <w:r>
+              <w:rPr>
+                <w:rFonts w:ascii="Courier New" w:eastAsia="Courier New" w:hAnsi="Courier New" w:cs="Courier New"/>
+                <w:color w:val="9CDCFE"/>
+                <w:sz w:val="17"/>
+                <w:szCs w:val="17"/>
+              </w:rPr>
+              <w:t xml:space="preserve">      "schema_on_each_event":   false,</w:t>
+            </w:r>
+          </w:p>
+          <w:p>
+            <w:r>
+              <w:rPr>
+                <w:rFonts w:ascii="Courier New" w:eastAsia="Courier New" w:hAnsi="Courier New" w:cs="Courier New"/>
+                <w:color w:val="9CDCFE"/>
+                <w:sz w:val="17"/>
+                <w:szCs w:val="17"/>
+              </w:rPr>
+              <w:t xml:space="preserve">      "schema_by_reference":    false</w:t>
+            </w:r>
+          </w:p>
+          <w:p>
+            <w:r>
+              <w:rPr>
+                <w:rFonts w:ascii="Courier New" w:eastAsia="Courier New" w:hAnsi="Courier New" w:cs="Courier New"/>
+                <w:color w:val="D4D4D4"/>
+                <w:sz w:val="17"/>
+                <w:szCs w:val="17"/>
+              </w:rPr>
+              <w:t xml:space="preserve">    },</w:t>
+            </w:r>
+          </w:p>
+          <w:p>
+            <w:r>
+              <w:rPr>
+                <w:rFonts w:ascii="Courier New" w:eastAsia="Courier New" w:hAnsi="Courier New" w:cs="Courier New"/>
+                <w:color w:val="9CDCFE"/>
+                <w:sz w:val="17"/>
+                <w:szCs w:val="17"/>
+              </w:rPr>
+              <w:t xml:space="preserve">    "sequence_continuity":        "guaranteed"</w:t>
             </w:r>
           </w:p>
           <w:p>
@@ -2552,7 +2575,7 @@
                 <w:sz w:val="18"/>
                 <w:szCs w:val="18"/>
               </w:rPr>
-              <w:t>STREAM_METADATA is sent to the connecting consumer only. It is not inserted into the durable event log. On reconnect, the consumer receives a new STREAM_METADATA followed by current OBJECT_METADATA events (Approach 1), then the durable stream resumes from the saved cdcpos.</w:t>
+              <w:t>STREAM_METADATA is sent to the connecting consumer only. It is not inserted into the durable event log. On reconnect, the consumer receives a new STREAM_METADATA followed by current OBJECT_METADATA events (Schema on Reconnect mode, Section 4.5.2), then the durable stream resumes from the saved cdcpos. The active schema delivery modes are declared in the schema_delivery object of STREAM_METADATA data.</w:t>
             </w:r>
           </w:p>
           <w:p>
@@ -2952,7 +2975,7 @@
                 <w:sz w:val="17"/>
                 <w:szCs w:val="17"/>
               </w:rPr>
-              <w:t>""</w:t>
+              <w:t>"</w:t>
             </w:r>
             <w:r>
               <w:rPr>
@@ -3233,7 +3256,7 @@
                 <w:sz w:val="17"/>
                 <w:szCs w:val="17"/>
               </w:rPr>
-              <w:t>"0.3"</w:t>
+              <w:t>"0.2"</w:t>
             </w:r>
             <w:r>
               <w:rPr>
@@ -9474,23 +9497,16 @@
               </w:rPr>
               <w:t xml:space="preserve">              </w:t>
             </w:r>
-            <w:r>
-              <w:rPr>
-                <w:rFonts w:ascii="Courier New" w:eastAsia="Courier New" w:hAnsi="Courier New" w:cs="Courier New"/>
-                <w:color w:val="A5D6FF"/>
-                <w:sz w:val="17"/>
-                <w:szCs w:val="17"/>
-              </w:rPr>
-              <w:t>"https:"</w:t>
-            </w:r>
-            <w:r>
-              <w:rPr>
-                <w:rFonts w:ascii="Courier New" w:eastAsia="Courier New" w:hAnsi="Courier New" w:cs="Courier New"/>
-                <w:color w:val="3FB950"/>
-                <w:sz w:val="17"/>
-                <w:szCs w:val="17"/>
-              </w:rPr>
-              <w:t>//json-schema.org/draft/2020-12/schema",</w:t>
+          </w:p>
+          <w:p>
+            <w:r>
+              <w:rPr>
+                <w:rFonts w:ascii="Courier New" w:eastAsia="Courier New" w:hAnsi="Courier New" w:cs="Courier New"/>
+                <w:color w:val="CE9178"/>
+                <w:sz w:val="17"/>
+                <w:szCs w:val="17"/>
+              </w:rPr>
+              <w:t xml:space="preserve">"https://json-schema.org/draft/2020-12/schema",</w:t>
             </w:r>
           </w:p>
           <w:p>
@@ -12833,7 +12849,7 @@
                 <w:sz w:val="17"/>
                 <w:szCs w:val="17"/>
               </w:rPr>
-              <w:t>""</w:t>
+              <w:t>"</w:t>
             </w:r>
             <w:r>
               <w:rPr>
@@ -13190,7 +13206,7 @@
                 <w:sz w:val="17"/>
                 <w:szCs w:val="17"/>
               </w:rPr>
-              <w:t>"0.3"</w:t>
+              <w:t>"0.2"</w:t>
             </w:r>
             <w:r>
               <w:rPr>
@@ -15258,7 +15274,7 @@
                 <w:sz w:val="17"/>
                 <w:szCs w:val="17"/>
               </w:rPr>
-              <w:t>"sequence"</w:t>
+              <w:t>"lsn_offset"</w:t>
             </w:r>
             <w:r>
               <w:rPr>
@@ -15871,7 +15887,7 @@
                 <w:sz w:val="17"/>
                 <w:szCs w:val="17"/>
               </w:rPr>
-              <w:t>""</w:t>
+              <w:t>"</w:t>
             </w:r>
             <w:r>
               <w:rPr>
@@ -16210,7 +16226,7 @@
                 <w:sz w:val="17"/>
                 <w:szCs w:val="17"/>
               </w:rPr>
-              <w:t>"0.3"</w:t>
+              <w:t>"0.2"</w:t>
             </w:r>
             <w:r>
               <w:rPr>
@@ -18402,7 +18418,7 @@
                 <w:sz w:val="17"/>
                 <w:szCs w:val="17"/>
               </w:rPr>
-              <w:t>"sequence"</w:t>
+              <w:t>"lsn_offset"</w:t>
             </w:r>
             <w:r>
               <w:rPr>
@@ -18935,7 +18951,7 @@
                 <w:sz w:val="17"/>
                 <w:szCs w:val="17"/>
               </w:rPr>
-              <w:t>""</w:t>
+              <w:t>"</w:t>
             </w:r>
             <w:r>
               <w:rPr>
@@ -19274,7 +19290,7 @@
                 <w:sz w:val="17"/>
                 <w:szCs w:val="17"/>
               </w:rPr>
-              <w:t>"0.3"</w:t>
+              <w:t>"0.2"</w:t>
             </w:r>
             <w:r>
               <w:rPr>
@@ -21232,7 +21248,7 @@
                 <w:sz w:val="17"/>
                 <w:szCs w:val="17"/>
               </w:rPr>
-              <w:t>"sequence"</w:t>
+              <w:t>"lsn_offset"</w:t>
             </w:r>
             <w:r>
               <w:rPr>
@@ -21758,7 +21774,7 @@
                 <w:sz w:val="17"/>
                 <w:szCs w:val="17"/>
               </w:rPr>
-              <w:t>""</w:t>
+              <w:t>"</w:t>
             </w:r>
             <w:r>
               <w:rPr>
@@ -21981,7 +21997,7 @@
                 <w:sz w:val="17"/>
                 <w:szCs w:val="17"/>
               </w:rPr>
-              <w:t>"0.3"</w:t>
+              <w:t>"0.2"</w:t>
             </w:r>
             <w:r>
               <w:rPr>
@@ -22279,6 +22295,28 @@
                 <w:szCs w:val="17"/>
               </w:rPr>
               <w:t>// false = capture process paused or failed</w:t>
+            </w:r>
+          </w:p>
+          <w:p>
+            <w:r>
+              <w:rPr>
+                <w:rFonts w:ascii="Courier New" w:eastAsia="Courier New" w:hAnsi="Courier New" w:cs="Courier New"/>
+                <w:color w:val="9CDCFE"/>
+                <w:sz w:val="17"/>
+                <w:szCs w:val="17"/>
+              </w:rPr>
+              <w:t xml:space="preserve">    "lsn_reset":       false,</w:t>
+            </w:r>
+          </w:p>
+          <w:p>
+            <w:r>
+              <w:rPr>
+                <w:rFonts w:ascii="Courier New" w:eastAsia="Courier New" w:hAnsi="Courier New" w:cs="Courier New"/>
+                <w:color w:val="9CDCFE"/>
+                <w:sz w:val="17"/>
+                <w:szCs w:val="17"/>
+              </w:rPr>
+              <w:t xml:space="preserve">    "sequence_reset":  false,</w:t>
             </w:r>
           </w:p>
           <w:p>
@@ -22466,7 +22504,7 @@
                 <w:sz w:val="17"/>
                 <w:szCs w:val="17"/>
               </w:rPr>
-              <w:t>"sequence"</w:t>
+              <w:t>"lsn_offset"</w:t>
             </w:r>
             <w:r>
               <w:rPr>
@@ -25427,7 +25465,7 @@
               <v:stroke joinstyle="miter"/>
               <v:path gradientshapeok="t" o:connecttype="rect"/>
             </v:shapetype>
-            <v:shape id="Text Box 5" o:spid="_x0000_s1028" type="#_x0000_t202" alt="Confidential - Oracle Restricted \Employees Only" style="position:absolute;margin-left:0;margin-top:0;width:34.95pt;height:34.95pt;z-index:251662336;visibility:visible;mso-wrap-style:none;mso-wrap-distance-left:0;mso-wrap-distance-top:0;mso-wrap-distance-right:0;mso-wrap-distance-bottom:0;mso-position-horizontal:left;mso-position-horizontal-relative:page;mso-position-vertical:bottom;mso-position-vertical-relative:page;v-text-anchor:bottom" o:gfxdata="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" filled="f" stroked="f">
+            <v:shape id="Text Box 5" o:spid="_x0000_s1028" type="#_x0000_t202" alt="Confidential - Oracle Restricted \Employees Only" style="position:absolute;margin-left:0;margin-top:0;width:34.95pt;height:34.95pt;z-index:251662336;visibility:visible;mso-wrap-style:none;mso-wrap-distance-left:0;mso-wrap-distance-top:0;mso-wrap-distance-right:0;mso-wrap-distance-bottom:0;mso-position-horizontal:left;mso-position-horizontal-relative:page;mso-position-vertical:bottom;mso-position-vertical-relative:page;v-text-anchor:bottom" o:gfxdata="UEsDBBQABgAIAAAAIQC2gziS/gAAAOEBAAATAAAAW0NvbnRlbnRfVHlwZXNdLnhtbJSRQU7DMBBF 90jcwfIWJU67QAgl6YK0S0CoHGBkTxKLZGx5TGhvj5O2G0SRWNoz/78nu9wcxkFMGNg6quQqL6RA 0s5Y6ir5vt9lD1JwBDIwOMJKHpHlpr69KfdHjyxSmriSfYz+USnWPY7AufNIadK6MEJMx9ApD/oD OlTrorhX2lFEilmcO2RdNtjC5xDF9pCuTyYBB5bi6bQ4syoJ3g9WQ0ymaiLzg5KdCXlKLjvcW893 SUOqXwnz5DrgnHtJTxOsQfEKIT7DmDSUCaxw7Rqn8787ZsmRM9e2VmPeBN4uqYvTtW7jvijg9N/y JsXecLq0q+WD6m8AAAD//wMAUEsDBBQABgAIAAAAIQA4/SH/1gAAAJQBAAALAAAAX3JlbHMvLnJl bHOkkMFqwzAMhu+DvYPRfXGawxijTi+j0GvpHsDYimMaW0Yy2fr2M4PBMnrbUb/Q94l/f/hMi1qR JVI2sOt6UJgd+ZiDgffL8ekFlFSbvV0oo4EbChzGx4f9GRdb25HMsYhqlCwG5lrLq9biZkxWOiqY 22YiTra2kYMu1l1tQD30/bPm3wwYN0x18gb45AdQl1tp5j/sFB2T0FQ7R0nTNEV3j6o9feQzro1i OWA14Fm+Q8a1a8+Bvu/d/dMb2JY5uiPbhG/ktn4cqGU/er3pcvwCAAD//wMAUEsDBBQABgAIAAAA IQAmoNP/DwIAACEEAAAOAAAAZHJzL2Uyb0RvYy54bWysU01v2zAMvQ/YfxB0X+xkSdEacYqsRYYB QVsgHXpWZCk2IImCpMTOfv0o2U62bqdhF/mJpPnx+LS877QiJ+F8A6ak00lOiTAcqsYcSvr9dfPp lhIfmKmYAiNKehae3q8+fli2thAzqEFVwhFMYnzR2pLWIdgiyzyvhWZ+AlYYdEpwmgW8ukNWOdZi dq2yWZ7fZC24yjrgwnu0PvZOukr5pRQ8PEvpRSCqpNhbSKdL5z6e2WrJioNjtm740Ab7hy40awwW vaR6ZIGRo2v+SKUb7sCDDBMOOgMpGy7SDDjNNH83za5mVqRZkBxvLzT5/5eWP5129sWR0H2BDhcY CWmtLzwa4zyddDp+sVOCfqTwfKFNdIFwNM7nn29vFpRwdA0Ys2TXn63z4asATSIoqcOtJLLYaetD HzqGxFoGNo1SaTPK/GbAnNGSXTuMKHT7jjRVSWdj93uozjiUg37f3vJNg6W3zIcX5nDBOAeKNjzj IRW0JYUBUVKD+/E3e4xH3tFLSYuCKalBRVOivhncx2wxz/MosHRD4EawT2B6ly+i3xz1A6AWp/gs LE8wBgc1QulAv6Gm17EaupjhWLOk+xE+hF6++Ca4WK9TEGrJsrA1O8tj6shZJPS1e2PODqwHXNcT jJJixTvy+9j4p7frY8AVpM1Efns2B9pRh2m3w5uJQv/1nqKuL3v1EwAA//8DAFBLAwQUAAYACAAA ACEA2G08/tcAAAADAQAADwAAAGRycy9kb3ducmV2LnhtbEyPT0/DMAzF70h8h8hI3FjKDhUrTaeJ f+JKmQRHt/Gaao1T6mwr354AB7j4yXrWez+X69kP6kiT9IENXC8yUMRtsD13Bravj1c3oCQiWxwC k4FPElhX52clFjac+IWOdexUCmEp0ICLcSy0ltaRR1mEkTh5uzB5jGmdOm0nPKVwP+hlluXaY8+p weFId47afX3wBvL7p40b3/L3j91SnqUJ+1iHB2MuL+bNLahIc/w7hm/8hA5VYmrCga2owUB6JP7M 5OWrFajmV3VV6v/s1RcAAAD//wMAUEsBAi0AFAAGAAgAAAAhALaDOJL+AAAA4QEAABMAAAAAAAAA AAAAAAAAAAAAAFtDb250ZW50X1R5cGVzXS54bWxQSwECLQAUAAYACAAAACEAOP0h/9YAAACUAQAA CwAAAAAAAAAAAAAAAAAvAQAAX3JlbHMvLnJlbHNQSwECLQAUAAYACAAAACEAJqDT/w8CAAAhBAAA DgAAAAAAAAAAAAAAAAAuAgAAZHJzL2Uyb0RvYy54bWxQSwECLQAUAAYACAAAACEA2G08/tcAAAAD AQAADwAAAAAAAAAAAAAAAABpBAAAZHJzL2Rvd25yZXYueG1sUEsFBgAAAAAEAAQA8wAAAG0FAAAA AA== " filled="f" stroked="f">
               <v:fill o:detectmouseclick="t"/>
               <v:textbox style="mso-fit-shape-to-text:t" inset="20pt,0,0,15pt">
                 <w:txbxContent>
@@ -25557,7 +25595,7 @@
               <v:stroke joinstyle="miter"/>
               <v:path gradientshapeok="t" o:connecttype="rect"/>
             </v:shapetype>
-            <v:shape id="Text Box 6" o:spid="_x0000_s1029" type="#_x0000_t202" alt="Confidential - Oracle Restricted \Employees Only" style="position:absolute;margin-left:0;margin-top:0;width:34.95pt;height:34.95pt;z-index:251663360;visibility:visible;mso-wrap-style:none;mso-wrap-distance-left:0;mso-wrap-distance-top:0;mso-wrap-distance-right:0;mso-wrap-distance-bottom:0;mso-position-horizontal:left;mso-position-horizontal-relative:page;mso-position-vertical:bottom;mso-position-vertical-relative:page;v-text-anchor:bottom" o:gfxdata="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" filled="f" stroked="f">
+            <v:shape id="Text Box 6" o:spid="_x0000_s1029" type="#_x0000_t202" alt="Confidential - Oracle Restricted \Employees Only" style="position:absolute;margin-left:0;margin-top:0;width:34.95pt;height:34.95pt;z-index:251663360;visibility:visible;mso-wrap-style:none;mso-wrap-distance-left:0;mso-wrap-distance-top:0;mso-wrap-distance-right:0;mso-wrap-distance-bottom:0;mso-position-horizontal:left;mso-position-horizontal-relative:page;mso-position-vertical:bottom;mso-position-vertical-relative:page;v-text-anchor:bottom" o:gfxdata="UEsDBBQABgAIAAAAIQC2gziS/gAAAOEBAAATAAAAW0NvbnRlbnRfVHlwZXNdLnhtbJSRQU7DMBBF 90jcwfIWJU67QAgl6YK0S0CoHGBkTxKLZGx5TGhvj5O2G0SRWNoz/78nu9wcxkFMGNg6quQqL6RA 0s5Y6ir5vt9lD1JwBDIwOMJKHpHlpr69KfdHjyxSmriSfYz+USnWPY7AufNIadK6MEJMx9ApD/oD OlTrorhX2lFEilmcO2RdNtjC5xDF9pCuTyYBB5bi6bQ4syoJ3g9WQ0ymaiLzg5KdCXlKLjvcW893 SUOqXwnz5DrgnHtJTxOsQfEKIT7DmDSUCaxw7Rqn8787ZsmRM9e2VmPeBN4uqYvTtW7jvijg9N/y JsXecLq0q+WD6m8AAAD//wMAUEsDBBQABgAIAAAAIQA4/SH/1gAAAJQBAAALAAAAX3JlbHMvLnJl bHOkkMFqwzAMhu+DvYPRfXGawxijTi+j0GvpHsDYimMaW0Yy2fr2M4PBMnrbUb/Q94l/f/hMi1qR JVI2sOt6UJgd+ZiDgffL8ekFlFSbvV0oo4EbChzGx4f9GRdb25HMsYhqlCwG5lrLq9biZkxWOiqY 22YiTra2kYMu1l1tQD30/bPm3wwYN0x18gb45AdQl1tp5j/sFB2T0FQ7R0nTNEV3j6o9feQzro1i OWA14Fm+Q8a1a8+Bvu/d/dMb2JY5uiPbhG/ktn4cqGU/er3pcvwCAAD//wMAUEsDBBQABgAIAAAA IQDWL1J3EAIAACEEAAAOAAAAZHJzL2Uyb0RvYy54bWysU01v2zAMvQ/YfxB0X+ykSdEZcYqsRYYB QVsgHXpWZCk2IImCpMTOfv0o2U62bqdhF/mJpPnx+LS877QiJ+F8A6ak00lOiTAcqsYcSvr9dfPp jhIfmKmYAiNKehae3q8+fli2thAzqEFVwhFMYnzR2pLWIdgiyzyvhWZ+AlYYdEpwmgW8ukNWOdZi dq2yWZ7fZi24yjrgwnu0PvZOukr5pRQ8PEvpRSCqpNhbSKdL5z6e2WrJioNjtm740Ab7hy40awwW vaR6ZIGRo2v+SKUb7sCDDBMOOgMpGy7SDDjNNH83za5mVqRZkBxvLzT5/5eWP5129sWR0H2BDhcY CWmtLzwa4zyddDp+sVOCfqTwfKFNdIFwNM7nN3e3C0o4ugaMWbLrz9b58FWAJhGU1OFWElnstPWh Dx1DYi0Dm0aptBllfjNgzmjJrh1GFLp9R5qqpDdj93uozjiUg37f3vJNg6W3zIcX5nDBOAeKNjzj IRW0JYUBUVKD+/E3e4xH3tFLSYuCKalBRVOivhncx2wxz/MosHRD4EawT2D6OV9EvznqB0AtTvFZ WJ5gDA5qhNKBfkNNr2M1dDHDsWZJ9yN8CL188U1wsV6nINSSZWFrdpbH1JGzSOhr98acHVgPuK4n GCXFinfk97HxT2/Xx4ArSJuJ/PZsDrSjDtNuhzcThf7rPUVdX/bqJwAAAP//AwBQSwMEFAAGAAgA AAAhANhtPP7XAAAAAwEAAA8AAABkcnMvZG93bnJldi54bWxMj09PwzAMxe9IfIfISNxYyg4VK02n iX/iSpkER7fxmmqNU+psK9+eAAe4+Ml61ns/l+vZD+pIk/SBDVwvMlDEbbA9dwa2r49XN6AkIlsc ApOBTxJYV+dnJRY2nPiFjnXsVAphKdCAi3EstJbWkUdZhJE4ebsweYxpnTptJzylcD/oZZbl2mPP qcHhSHeO2n198Aby+6eNG9/y94/dUp6lCftYhwdjLi/mzS2oSHP8O4Zv/IQOVWJqwoGtqMFAeiT+ zOTlqxWo5ld1Ver/7NUXAAAA//8DAFBLAQItABQABgAIAAAAIQC2gziS/gAAAOEBAAATAAAAAAAA AAAAAAAAAAAAAABbQ29udGVudF9UeXBlc10ueG1sUEsBAi0AFAAGAAgAAAAhADj9If/WAAAAlAEA AAsAAAAAAAAAAAAAAAAALwEAAF9yZWxzLy5yZWxzUEsBAi0AFAAGAAgAAAAhANYvUncQAgAAIQQA AA4AAAAAAAAAAAAAAAAALgIAAGRycy9lMm9Eb2MueG1sUEsBAi0AFAAGAAgAAAAhANhtPP7XAAAA AwEAAA8AAAAAAAAAAAAAAAAAagQAAGRycy9kb3ducmV2LnhtbFBLBQYAAAAABAAEAPMAAABuBQAA AAA= " filled="f" stroked="f">
               <v:fill o:detectmouseclick="t"/>
               <v:textbox style="mso-fit-shape-to-text:t" inset="20pt,0,0,15pt">
                 <w:txbxContent>
@@ -25703,7 +25741,7 @@
               <v:stroke joinstyle="miter"/>
               <v:path gradientshapeok="t" o:connecttype="rect"/>
             </v:shapetype>
-            <v:shape id="Text Box 4" o:spid="_x0000_s1031" type="#_x0000_t202" alt="Confidential - Oracle Restricted \Employees Only" style="position:absolute;margin-left:0;margin-top:0;width:34.95pt;height:34.95pt;z-index:251661312;visibility:visible;mso-wrap-style:none;mso-wrap-distance-left:0;mso-wrap-distance-top:0;mso-wrap-distance-right:0;mso-wrap-distance-bottom:0;mso-position-horizontal:left;mso-position-horizontal-relative:page;mso-position-vertical:bottom;mso-position-vertical-relative:page;v-text-anchor:bottom" o:gfxdata="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" filled="f" stroked="f">
+            <v:shape id="Text Box 4" o:spid="_x0000_s1031" type="#_x0000_t202" alt="Confidential - Oracle Restricted \Employees Only" style="position:absolute;margin-left:0;margin-top:0;width:34.95pt;height:34.95pt;z-index:251661312;visibility:visible;mso-wrap-style:none;mso-wrap-distance-left:0;mso-wrap-distance-top:0;mso-wrap-distance-right:0;mso-wrap-distance-bottom:0;mso-position-horizontal:left;mso-position-horizontal-relative:page;mso-position-vertical:bottom;mso-position-vertical-relative:page;v-text-anchor:bottom" o:gfxdata="UEsDBBQABgAIAAAAIQC2gziS/gAAAOEBAAATAAAAW0NvbnRlbnRfVHlwZXNdLnhtbJSRQU7DMBBF 90jcwfIWJU67QAgl6YK0S0CoHGBkTxKLZGx5TGhvj5O2G0SRWNoz/78nu9wcxkFMGNg6quQqL6RA 0s5Y6ir5vt9lD1JwBDIwOMJKHpHlpr69KfdHjyxSmriSfYz+USnWPY7AufNIadK6MEJMx9ApD/oD OlTrorhX2lFEilmcO2RdNtjC5xDF9pCuTyYBB5bi6bQ4syoJ3g9WQ0ymaiLzg5KdCXlKLjvcW893 SUOqXwnz5DrgnHtJTxOsQfEKIT7DmDSUCaxw7Rqn8787ZsmRM9e2VmPeBN4uqYvTtW7jvijg9N/y JsXecLq0q+WD6m8AAAD//wMAUEsDBBQABgAIAAAAIQA4/SH/1gAAAJQBAAALAAAAX3JlbHMvLnJl bHOkkMFqwzAMhu+DvYPRfXGawxijTi+j0GvpHsDYimMaW0Yy2fr2M4PBMnrbUb/Q94l/f/hMi1qR JVI2sOt6UJgd+ZiDgffL8ekFlFSbvV0oo4EbChzGx4f9GRdb25HMsYhqlCwG5lrLq9biZkxWOiqY 22YiTra2kYMu1l1tQD30/bPm3wwYN0x18gb45AdQl1tp5j/sFB2T0FQ7R0nTNEV3j6o9feQzro1i OWA14Fm+Q8a1a8+Bvu/d/dMb2JY5uiPbhG/ktn4cqGU/er3pcvwCAAD//wMAUEsDBBQABgAIAAAA IQB0A7XyDwIAACEEAAAOAAAAZHJzL2Uyb0RvYy54bWysU01v2zAMvQ/YfxB0X+xkSdEacYqsRYYB QVsgHXpWZCk2IImCpMTOfv0o2U62bqdhF/mJpPnx+LS877QiJ+F8A6ak00lOiTAcqsYcSvr9dfPp lhIfmKmYAiNKehae3q8+fli2thAzqEFVwhFMYnzR2pLWIdgiyzyvhWZ+AlYYdEpwmgW8ukNWOdZi dq2yWZ7fZC24yjrgwnu0PvZOukr5pRQ8PEvpRSCqpNhbSKdL5z6e2WrJioNjtm740Ab7hy40awwW vaR6ZIGRo2v+SKUb7sCDDBMOOgMpGy7SDDjNNH83za5mVqRZkBxvLzT5/5eWP5129sWR0H2BDhcY CWmtLzwa4zyddDp+sVOCfqTwfKFNdIFwNM7nn29vFpRwdA0Ys2TXn63z4asATSIoqcOtJLLYaetD HzqGxFoGNo1SaTPK/GbAnNGSXTuMKHT7jjRVSRdj93uozjiUg37f3vJNg6W3zIcX5nDBOAeKNjzj IRW0JYUBUVKD+/E3e4xH3tFLSYuCKalBRVOivhncx2wxz/MosHRD4EawT2B6ly+i3xz1A6AWp/gs LE8wBgc1QulAv6Gm17EaupjhWLOk+xE+hF6++Ca4WK9TEGrJsrA1O8tj6shZJPS1e2PODqwHXNcT jJJixTvy+9j4p7frY8AVpM1Efns2B9pRh2m3w5uJQv/1nqKuL3v1EwAA//8DAFBLAwQUAAYACAAA ACEA2G08/tcAAAADAQAADwAAAGRycy9kb3ducmV2LnhtbEyPT0/DMAzF70h8h8hI3FjKDhUrTaeJ f+JKmQRHt/Gaao1T6mwr354AB7j4yXrWez+X69kP6kiT9IENXC8yUMRtsD13Bravj1c3oCQiWxwC k4FPElhX52clFjac+IWOdexUCmEp0ICLcSy0ltaRR1mEkTh5uzB5jGmdOm0nPKVwP+hlluXaY8+p weFId47afX3wBvL7p40b3/L3j91SnqUJ+1iHB2MuL+bNLahIc/w7hm/8hA5VYmrCga2owUB6JP7M 5OWrFajmV3VV6v/s1RcAAAD//wMAUEsBAi0AFAAGAAgAAAAhALaDOJL+AAAA4QEAABMAAAAAAAAA AAAAAAAAAAAAAFtDb250ZW50X1R5cGVzXS54bWxQSwECLQAUAAYACAAAACEAOP0h/9YAAACUAQAA CwAAAAAAAAAAAAAAAAAvAQAAX3JlbHMvLnJlbHNQSwECLQAUAAYACAAAACEAdAO18g8CAAAhBAAA DgAAAAAAAAAAAAAAAAAuAgAAZHJzL2Uyb0RvYy54bWxQSwECLQAUAAYACAAAACEA2G08/tcAAAAD AQAADwAAAAAAAAAAAAAAAABpBAAAZHJzL2Rvd25yZXYueG1sUEsFBgAAAAAEAAQA8wAAAG0FAAAA AA== " filled="f" stroked="f">
               <v:fill o:detectmouseclick="t"/>
               <v:textbox style="mso-fit-shape-to-text:t" inset="20pt,0,0,15pt">
                 <w:txbxContent>
@@ -25843,7 +25881,7 @@
               <v:stroke joinstyle="miter"/>
               <v:path gradientshapeok="t" o:connecttype="rect"/>
             </v:shapetype>
-            <v:shape id="Text Box 2" o:spid="_x0000_s1026" type="#_x0000_t202" alt="Confidential - Oracle Restricted \Employees Only" style="position:absolute;margin-left:0;margin-top:0;width:34.95pt;height:34.95pt;z-index:251659264;visibility:visible;mso-wrap-style:none;mso-wrap-distance-left:0;mso-wrap-distance-top:0;mso-wrap-distance-right:0;mso-wrap-distance-bottom:0;mso-position-horizontal:left;mso-position-horizontal-relative:page;mso-position-vertical:top;mso-position-vertical-relative:page;v-text-anchor:top" o:gfxdata="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" filled="f" stroked="f">
+            <v:shape id="Text Box 2" o:spid="_x0000_s1026" type="#_x0000_t202" alt="Confidential - Oracle Restricted \Employees Only" style="position:absolute;margin-left:0;margin-top:0;width:34.95pt;height:34.95pt;z-index:251659264;visibility:visible;mso-wrap-style:none;mso-wrap-distance-left:0;mso-wrap-distance-top:0;mso-wrap-distance-right:0;mso-wrap-distance-bottom:0;mso-position-horizontal:left;mso-position-horizontal-relative:page;mso-position-vertical:top;mso-position-vertical-relative:page;v-text-anchor:top" o:gfxdata="UEsDBBQABgAIAAAAIQC2gziS/gAAAOEBAAATAAAAW0NvbnRlbnRfVHlwZXNdLnhtbJSRQU7DMBBF 90jcwfIWJU67QAgl6YK0S0CoHGBkTxKLZGx5TGhvj5O2G0SRWNoz/78nu9wcxkFMGNg6quQqL6RA 0s5Y6ir5vt9lD1JwBDIwOMJKHpHlpr69KfdHjyxSmriSfYz+USnWPY7AufNIadK6MEJMx9ApD/oD OlTrorhX2lFEilmcO2RdNtjC5xDF9pCuTyYBB5bi6bQ4syoJ3g9WQ0ymaiLzg5KdCXlKLjvcW893 SUOqXwnz5DrgnHtJTxOsQfEKIT7DmDSUCaxw7Rqn8787ZsmRM9e2VmPeBN4uqYvTtW7jvijg9N/y JsXecLq0q+WD6m8AAAD//wMAUEsDBBQABgAIAAAAIQA4/SH/1gAAAJQBAAALAAAAX3JlbHMvLnJl bHOkkMFqwzAMhu+DvYPRfXGawxijTi+j0GvpHsDYimMaW0Yy2fr2M4PBMnrbUb/Q94l/f/hMi1qR JVI2sOt6UJgd+ZiDgffL8ekFlFSbvV0oo4EbChzGx4f9GRdb25HMsYhqlCwG5lrLq9biZkxWOiqY 22YiTra2kYMu1l1tQD30/bPm3wwYN0x18gb45AdQl1tp5j/sFB2T0FQ7R0nTNEV3j6o9feQzro1i OWA14Fm+Q8a1a8+Bvu/d/dMb2JY5uiPbhG/ktn4cqGU/er3pcvwCAAD//wMAUEsDBBQABgAIAAAA IQBrvJ9/CgIAABoEAAAOAAAAZHJzL2Uyb0RvYy54bWysU1tr2zAUfh/sPwi9L3aypLQmTslaMgah LaSjz4osxQZJR0hK7OzX70i2k63b09iLfG4+l+98Z3nfaUVOwvkGTEmnk5wSYThUjTmU9Pvr5tMt JT4wUzEFRpT0LDy9X338sGxtIWZQg6qEI5jE+KK1Ja1DsEWWeV4LzfwErDDolOA0C6i6Q1Y51mJ2 rbJZnt9kLbjKOuDCe7Q+9k66SvmlFDw8S+lFIKqk2FtIr0vvPr7ZasmKg2O2bvjQBvuHLjRrDBa9 pHpkgZGja/5IpRvuwIMMEw46AykbLtIMOM00fzfNrmZWpFkQHG8vMPn/l5Y/nXb2xZHQfYEOFxgB aa0vPBrjPJ10On6xU4J+hPB8gU10gXA0zuefb28WlHB0DTJmya4/W+fDVwGaRKGkDreSwGKnrQ99 6BgSaxnYNEqlzSjzmwFzRkt27TBKodt3Q9t7qM44jYN+0d7yTYM1t8yHF+ZwszgAsjU84yMVtCWF QaKkBvfjb/YYj4Cjl5IWmVJSg1SmRH0zuIjZYp7nkVlJm97li6i5pKGwHwVz1A+AJJziPViexBgX 1ChKB/oNybyO1dDFDMeaJQ2j+BB63uIxcLFepyAkkWVha3aWx9QRrIjka/fGnB3gDrinJxi5xIp3 qPex8U9v18eA2KeVRGB7NAe8kYBpqcOxRIb/qqeo60mvfgIAAP//AwBQSwMEFAAGAAgAAAAhAHOb n2zZAAAAAwEAAA8AAABkcnMvZG93bnJldi54bWxMj09Lw0AQxe9Cv8Mygje7UWyxMZtSBEHBItai 12l28gezsyG7adJv76gHvcxjeMN7v8nWk2vVkfrQeDZwNU9AERfeNlwZ2L89XN6CChHZYuuZDJwo wDqfnWWYWj/yKx13sVISwiFFA3WMXap1KGpyGOa+Ixav9L3DKGtfadvjKOGu1ddJstQOG5aGGju6 r6n43A3OwONN+IhDWS7C9nk7Jk+j2w8v78ZcnE+bO1CRpvh3DN/4gg65MB38wDao1oA8En+meMvV CtThV3We6f/s+RcAAAD//wMAUEsBAi0AFAAGAAgAAAAhALaDOJL+AAAA4QEAABMAAAAAAAAAAAAA AAAAAAAAAFtDb250ZW50X1R5cGVzXS54bWxQSwECLQAUAAYACAAAACEAOP0h/9YAAACUAQAACwAA AAAAAAAAAAAAAAAvAQAAX3JlbHMvLnJlbHNQSwECLQAUAAYACAAAACEAa7yffwoCAAAaBAAADgAA AAAAAAAAAAAAAAAuAgAAZHJzL2Uyb0RvYy54bWxQSwECLQAUAAYACAAAACEAc5ufbNkAAAADAQAA DwAAAAAAAAAAAAAAAABkBAAAZHJzL2Rvd25yZXYueG1sUEsFBgAAAAAEAAQA8wAAAGoFAAAAAA== " filled="f" stroked="f">
               <v:fill o:detectmouseclick="t"/>
               <v:textbox style="mso-fit-shape-to-text:t" inset="20pt,15pt,0,0">
                 <w:txbxContent>
@@ -25970,7 +26008,7 @@
               <v:stroke joinstyle="miter"/>
               <v:path gradientshapeok="t" o:connecttype="rect"/>
             </v:shapetype>
-            <v:shape id="Text Box 3" o:spid="_x0000_s1027" type="#_x0000_t202" alt="Confidential - Oracle Restricted \Employees Only" style="position:absolute;margin-left:0;margin-top:0;width:34.95pt;height:34.95pt;z-index:251660288;visibility:visible;mso-wrap-style:none;mso-wrap-distance-left:0;mso-wrap-distance-top:0;mso-wrap-distance-right:0;mso-wrap-distance-bottom:0;mso-position-horizontal:left;mso-position-horizontal-relative:page;mso-position-vertical:top;mso-position-vertical-relative:page;v-text-anchor:top" o:gfxdata="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" filled="f" stroked="f">
+            <v:shape id="Text Box 3" o:spid="_x0000_s1027" type="#_x0000_t202" alt="Confidential - Oracle Restricted \Employees Only" style="position:absolute;margin-left:0;margin-top:0;width:34.95pt;height:34.95pt;z-index:251660288;visibility:visible;mso-wrap-style:none;mso-wrap-distance-left:0;mso-wrap-distance-top:0;mso-wrap-distance-right:0;mso-wrap-distance-bottom:0;mso-position-horizontal:left;mso-position-horizontal-relative:page;mso-position-vertical:top;mso-position-vertical-relative:page;v-text-anchor:top" o:gfxdata="UEsDBBQABgAIAAAAIQC2gziS/gAAAOEBAAATAAAAW0NvbnRlbnRfVHlwZXNdLnhtbJSRQU7DMBBF 90jcwfIWJU67QAgl6YK0S0CoHGBkTxKLZGx5TGhvj5O2G0SRWNoz/78nu9wcxkFMGNg6quQqL6RA 0s5Y6ir5vt9lD1JwBDIwOMJKHpHlpr69KfdHjyxSmriSfYz+USnWPY7AufNIadK6MEJMx9ApD/oD OlTrorhX2lFEilmcO2RdNtjC5xDF9pCuTyYBB5bi6bQ4syoJ3g9WQ0ymaiLzg5KdCXlKLjvcW893 SUOqXwnz5DrgnHtJTxOsQfEKIT7DmDSUCaxw7Rqn8787ZsmRM9e2VmPeBN4uqYvTtW7jvijg9N/y JsXecLq0q+WD6m8AAAD//wMAUEsDBBQABgAIAAAAIQA4/SH/1gAAAJQBAAALAAAAX3JlbHMvLnJl bHOkkMFqwzAMhu+DvYPRfXGawxijTi+j0GvpHsDYimMaW0Yy2fr2M4PBMnrbUb/Q94l/f/hMi1qR JVI2sOt6UJgd+ZiDgffL8ekFlFSbvV0oo4EbChzGx4f9GRdb25HMsYhqlCwG5lrLq9biZkxWOiqY 22YiTra2kYMu1l1tQD30/bPm3wwYN0x18gb45AdQl1tp5j/sFB2T0FQ7R0nTNEV3j6o9feQzro1i OWA14Fm+Q8a1a8+Bvu/d/dMb2JY5uiPbhG/ktn4cqGU/er3pcvwCAAD//wMAUEsDBBQABgAIAAAA IQDp8XEJDQIAACEEAAAOAAAAZHJzL2Uyb0RvYy54bWysU11v2yAUfZ+0/4B4X+xkSdVZcaqsVaZJ UVspnfpMMMSWgIuAxM5+/S7YTrpuT9Ne8P3y5d5zDsu7TityEs43YEo6neSUCMOhasyhpD9eNp9u KfGBmYopMKKkZ+Hp3erjh2VrCzGDGlQlHMEmxhetLWkdgi2yzPNaaOYnYIXBpASnWUDXHbLKsRa7 a5XN8vwma8FV1gEX3mP0oU/SVeovpeDhSUovAlElxdlCOl069/HMVktWHByzdcOHMdg/TKFZY/DS S6sHFhg5uuaPVrrhDjzIMOGgM5Cy4SLtgNtM83fb7GpmRdoFwfH2ApP/f23542lnnx0J3VfokMAI SGt94TEY9+mk0/GLkxLMI4TnC2yiC4RjcD7/fHuzoIRjarCxS3b92TofvgnQJBoldchKAoudtj70 pWNJvMvAplEqMaPMbwHsGSPZdcJohW7fkaZ6M/0eqjMu5aDn21u+afDqLfPhmTkkGPdA0YYnPKSC tqQwWJTU4H7+LR7rEXfMUtKiYEpqUNGUqO8G+Zgt5nkeBZa86Zd8ET2XPDT2o2GO+h5Qi1N8FpYn M9YFNZrSgX5FTa/jbZhihuOdJQ2jeR96+eKb4GK9TkWoJcvC1uwsj60jZhHQl+6VOTugHpCuRxgl xYp34Pe18U9v18eAFCRmIr49mgPsqMPE7fBmotDf+qnq+rJXvwAAAP//AwBQSwMEFAAGAAgAAAAh AHObn2zZAAAAAwEAAA8AAABkcnMvZG93bnJldi54bWxMj09Lw0AQxe9Cv8Mygje7UWyxMZtSBEHB Itai12l28gezsyG7adJv76gHvcxjeMN7v8nWk2vVkfrQeDZwNU9AERfeNlwZ2L89XN6CChHZYuuZ DJwowDqfnWWYWj/yKx13sVISwiFFA3WMXap1KGpyGOa+Ixav9L3DKGtfadvjKOGu1ddJstQOG5aG Gju6r6n43A3OwONN+IhDWS7C9nk7Jk+j2w8v78ZcnE+bO1CRpvh3DN/4gg65MB38wDao1oA8En+m eMvVCtThV3We6f/s+RcAAAD//wMAUEsBAi0AFAAGAAgAAAAhALaDOJL+AAAA4QEAABMAAAAAAAAA AAAAAAAAAAAAAFtDb250ZW50X1R5cGVzXS54bWxQSwECLQAUAAYACAAAACEAOP0h/9YAAACUAQAA CwAAAAAAAAAAAAAAAAAvAQAAX3JlbHMvLnJlbHNQSwECLQAUAAYACAAAACEA6fFxCQ0CAAAhBAAA DgAAAAAAAAAAAAAAAAAuAgAAZHJzL2Uyb0RvYy54bWxQSwECLQAUAAYACAAAACEAc5ufbNkAAAAD AQAADwAAAAAAAAAAAAAAAABnBAAAZHJzL2Rvd25yZXYueG1sUEsFBgAAAAAEAAQA8wAAAG0FAAAA AA== " filled="f" stroked="f">
               <v:fill o:detectmouseclick="t"/>
               <v:textbox style="mso-fit-shape-to-text:t" inset="20pt,15pt,0,0">
                 <w:txbxContent>
@@ -26099,7 +26137,7 @@
               <v:stroke joinstyle="miter"/>
               <v:path gradientshapeok="t" o:connecttype="rect"/>
             </v:shapetype>
-            <v:shape id="Text Box 1" o:spid="_x0000_s1030" type="#_x0000_t202" alt="Confidential - Oracle Restricted \Employees Only" style="position:absolute;margin-left:0;margin-top:0;width:34.95pt;height:34.95pt;z-index:251658240;visibility:visible;mso-wrap-style:none;mso-wrap-distance-left:0;mso-wrap-distance-top:0;mso-wrap-distance-right:0;mso-wrap-distance-bottom:0;mso-position-horizontal:left;mso-position-horizontal-relative:page;mso-position-vertical:top;mso-position-vertical-relative:page;v-text-anchor:top" o:gfxdata="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" filled="f" stroked="f">
+            <v:shape id="Text Box 1" o:spid="_x0000_s1030" type="#_x0000_t202" alt="Confidential - Oracle Restricted \Employees Only" style="position:absolute;margin-left:0;margin-top:0;width:34.95pt;height:34.95pt;z-index:251658240;visibility:visible;mso-wrap-style:none;mso-wrap-distance-left:0;mso-wrap-distance-top:0;mso-wrap-distance-right:0;mso-wrap-distance-bottom:0;mso-position-horizontal:left;mso-position-horizontal-relative:page;mso-position-vertical:top;mso-position-vertical-relative:page;v-text-anchor:top" o:gfxdata="UEsDBBQABgAIAAAAIQC2gziS/gAAAOEBAAATAAAAW0NvbnRlbnRfVHlwZXNdLnhtbJSRQU7DMBBF 90jcwfIWJU67QAgl6YK0S0CoHGBkTxKLZGx5TGhvj5O2G0SRWNoz/78nu9wcxkFMGNg6quQqL6RA 0s5Y6ir5vt9lD1JwBDIwOMJKHpHlpr69KfdHjyxSmriSfYz+USnWPY7AufNIadK6MEJMx9ApD/oD OlTrorhX2lFEilmcO2RdNtjC5xDF9pCuTyYBB5bi6bQ4syoJ3g9WQ0ymaiLzg5KdCXlKLjvcW893 SUOqXwnz5DrgnHtJTxOsQfEKIT7DmDSUCaxw7Rqn8787ZsmRM9e2VmPeBN4uqYvTtW7jvijg9N/y JsXecLq0q+WD6m8AAAD//wMAUEsDBBQABgAIAAAAIQA4/SH/1gAAAJQBAAALAAAAX3JlbHMvLnJl bHOkkMFqwzAMhu+DvYPRfXGawxijTi+j0GvpHsDYimMaW0Yy2fr2M4PBMnrbUb/Q94l/f/hMi1qR JVI2sOt6UJgd+ZiDgffL8ekFlFSbvV0oo4EbChzGx4f9GRdb25HMsYhqlCwG5lrLq9biZkxWOiqY 22YiTra2kYMu1l1tQD30/bPm3wwYN0x18gb45AdQl1tp5j/sFB2T0FQ7R0nTNEV3j6o9feQzro1i OWA14Fm+Q8a1a8+Bvu/d/dMb2JY5uiPbhG/ktn4cqGU/er3pcvwCAAD//wMAUEsDBBQABgAIAAAA IQAaS2XODwIAACEEAAAOAAAAZHJzL2Uyb0RvYy54bWysU01v2zAMvQ/YfxB0X+xkSdEacYqsRYYB QVsgHXpWZCk2IImCpMTOfv0o2U62bqdhF5kiaX6897S877QiJ+F8A6ak00lOiTAcqsYcSvr9dfPp lhIfmKmYAiNKehae3q8+fli2thAzqEFVwhEsYnzR2pLWIdgiyzyvhWZ+AlYYDEpwmgW8ukNWOdZi da2yWZ7fZC24yjrgwnv0PvZBukr1pRQ8PEvpRSCqpDhbSKdL5z6e2WrJioNjtm74MAb7hyk0aww2 vZR6ZIGRo2v+KKUb7sCDDBMOOgMpGy7SDrjNNH+3za5mVqRdEBxvLzD5/1eWP5129sWR0H2BDgmM gLTWFx6dcZ9OOh2/OCnBOEJ4vsAmukA4Oufzz7c3C0o4hgYbq2TXn63z4asATaJRUoesJLDYaetD nzqmxF4GNo1SiRllfnNgzejJrhNGK3T7jjQVNh+n30N1xqUc9Hx7yzcNtt4yH16YQ4JxDxRteMZD KmhLCoNFSQ3ux9/8MR9xxyglLQqmpAYVTYn6ZpCP2WKe51Fg6Ta9yxfx5tINjf1omKN+ANTiFJ+F 5cmMeUGNpnSg31DT69gNQ8xw7FnSMJoPoZcvvgku1uuUhFqyLGzNzvJYOmIWAX3t3pizA+oB6XqC UVKseAd+nxv/9HZ9DEhBYibi26M5wI46TNwObyYK/dd7yrq+7NVPAAAA//8DAFBLAwQUAAYACAAA ACEAc5ufbNkAAAADAQAADwAAAGRycy9kb3ducmV2LnhtbEyPT0vDQBDF70K/wzKCN7tRbLExm1IE QcEi1qLXaXbyB7OzIbtp0m/vqAe9zGN4w3u/ydaTa9WR+tB4NnA1T0ARF942XBnYvz1c3oIKEdli 65kMnCjAOp+dZZhaP/IrHXexUhLCIUUDdYxdqnUoanIY5r4jFq/0vcMoa19p2+Mo4a7V10my1A4b loYaO7qvqfjcDc7A4034iENZLsL2eTsmT6PbDy/vxlycT5s7UJGm+HcM3/iCDrkwHfzANqjWgDwS f6Z4y9UK1OFXdZ7p/+z5FwAAAP//AwBQSwECLQAUAAYACAAAACEAtoM4kv4AAADhAQAAEwAAAAAA AAAAAAAAAAAAAAAAW0NvbnRlbnRfVHlwZXNdLnhtbFBLAQItABQABgAIAAAAIQA4/SH/1gAAAJQB AAALAAAAAAAAAAAAAAAAAC8BAABfcmVscy8ucmVsc1BLAQItABQABgAIAAAAIQAaS2XODwIAACEE AAAOAAAAAAAAAAAAAAAAAC4CAABkcnMvZTJvRG9jLnhtbFBLAQItABQABgAIAAAAIQBzm59s2QAA AAMBAAAPAAAAAAAAAAAAAAAAAGkEAABkcnMvZG93bnJldi54bWxQSwUGAAAAAAQABADzAAAAbwUA AAAA " filled="f" stroked="f">
               <v:fill o:detectmouseclick="t"/>
               <v:textbox style="mso-fit-shape-to-text:t" inset="20pt,15pt,0,0">
                 <w:txbxContent>

</xml_diff>